<commit_message>
Add GitHub repository URL to report
</commit_message>
<xml_diff>
--- a/reports/final_report.docx
+++ b/reports/final_report.docx
@@ -106,11 +106,7 @@
         <w:t xml:space="preserve"> </w:t>
       </w:r>
       <w:r>
-        <w:rPr>
-          <w:i/>
-          <w:iCs/>
-        </w:rPr>
-        <w:t xml:space="preserve">(GitHub URL added after push)</w:t>
+        <w:t xml:space="preserve">https://github.com/gangadharrr/MLOPS-Assignment-1</w:t>
       </w:r>
       <w:r>
         <w:t xml:space="preserve"> </w:t>

</xml_diff>

<commit_message>
Add CI evidence (Actions runs #1-#2 all green), README status badge, report CI section
</commit_message>
<xml_diff>
--- a/reports/final_report.docx
+++ b/reports/final_report.docx
@@ -3910,7 +3910,71 @@
         <w:t xml:space="preserve"> </w:t>
       </w:r>
       <w:r>
-        <w:t xml:space="preserve">outputs are traceable. The workflow file is in the repo; the first push triggers it on GitHub.</w:t>
+        <w:t xml:space="preserve">outputs are traceable.</w:t>
+      </w:r>
+      <w:r>
+        <w:t xml:space="preserve"> </w:t>
+      </w:r>
+      <w:r>
+        <w:rPr>
+          <w:b/>
+          <w:bCs/>
+        </w:rPr>
+        <w:t xml:space="preserve">Verified on GitHub Actions:</w:t>
+      </w:r>
+      <w:r>
+        <w:t xml:space="preserve"> </w:t>
+      </w:r>
+      <w:r>
+        <w:t xml:space="preserve">runs #1 (</w:t>
+      </w:r>
+      <w:r>
+        <w:rPr>
+          <w:rStyle w:val="VerbatimChar"/>
+        </w:rPr>
+        <w:t xml:space="preserve">ee06963</w:t>
+      </w:r>
+      <w:r>
+        <w:t xml:space="preserve">) and #2 (</w:t>
+      </w:r>
+      <w:r>
+        <w:rPr>
+          <w:rStyle w:val="VerbatimChar"/>
+        </w:rPr>
+        <w:t xml:space="preserve">5b0a28d</w:t>
+      </w:r>
+      <w:r>
+        <w:t xml:space="preserve">) both</w:t>
+      </w:r>
+      <w:r>
+        <w:t xml:space="preserve"> </w:t>
+      </w:r>
+      <w:r>
+        <w:t xml:space="preserve">completed with all steps green (lint → train → tests → image build → container smoke test →</w:t>
+      </w:r>
+      <w:r>
+        <w:t xml:space="preserve"> </w:t>
+      </w:r>
+      <w:r>
+        <w:t xml:space="preserve">artifact upload); step-level evidence in</w:t>
+      </w:r>
+      <w:r>
+        <w:t xml:space="preserve"> </w:t>
+      </w:r>
+      <w:r>
+        <w:rPr>
+          <w:rStyle w:val="VerbatimChar"/>
+        </w:rPr>
+        <w:t xml:space="preserve">screenshots/ci_verification.txt</w:t>
+      </w:r>
+      <w:r>
+        <w:t xml:space="preserve">, live status on the</w:t>
+      </w:r>
+      <w:r>
+        <w:t xml:space="preserve"> </w:t>
+      </w:r>
+      <w:r>
+        <w:t xml:space="preserve">repo’s Actions tab.</w:t>
       </w:r>
     </w:p>
     <w:p>
@@ -6816,6 +6880,60 @@
             </w:pPr>
             <w:r>
               <w:t xml:space="preserve">Shows</w:t>
+            </w:r>
+          </w:p>
+        </w:tc>
+      </w:tr>
+      <w:tr>
+        <w:tc>
+          <w:tcPr/>
+          <w:p>
+            <w:pPr>
+              <w:pStyle w:val="Compact"/>
+            </w:pPr>
+            <w:r>
+              <w:rPr>
+                <w:rStyle w:val="VerbatimChar"/>
+              </w:rPr>
+              <w:t xml:space="preserve">ci_verification.txt</w:t>
+            </w:r>
+          </w:p>
+        </w:tc>
+        <w:tc>
+          <w:tcPr/>
+          <w:p>
+            <w:pPr>
+              <w:pStyle w:val="Compact"/>
+            </w:pPr>
+            <w:r>
+              <w:t xml:space="preserve">GitHub Actions runs #1–#2: all steps green</w:t>
+            </w:r>
+          </w:p>
+        </w:tc>
+      </w:tr>
+      <w:tr>
+        <w:tc>
+          <w:tcPr/>
+          <w:p>
+            <w:pPr>
+              <w:pStyle w:val="Compact"/>
+            </w:pPr>
+            <w:r>
+              <w:rPr>
+                <w:rStyle w:val="VerbatimChar"/>
+              </w:rPr>
+              <w:t xml:space="preserve">clean_setup_verification.txt</w:t>
+            </w:r>
+          </w:p>
+        </w:tc>
+        <w:tc>
+          <w:tcPr/>
+          <w:p>
+            <w:pPr>
+              <w:pStyle w:val="Compact"/>
+            </w:pPr>
+            <w:r>
+              <w:t xml:space="preserve">fresh venv → flake8 → train (same metrics) → 20 tests pass</w:t>
             </w:r>
           </w:p>
         </w:tc>

</xml_diff>

<commit_message>
Add captioned pipeline walkthrough video; reference it in README and report; refresh regenerated figures
</commit_message>
<xml_diff>
--- a/reports/final_report.docx
+++ b/reports/final_report.docx
@@ -2,7 +2,7 @@
 <file path=word/document.xml><?xml version="1.0" encoding="utf-8"?>
 <w:document xmlns:w="http://schemas.openxmlformats.org/wordprocessingml/2006/main" xmlns:m="http://schemas.openxmlformats.org/officeDocument/2006/math" xmlns:r="http://schemas.openxmlformats.org/officeDocument/2006/relationships" xmlns:o="urn:schemas-microsoft-com:office:office" xmlns:v="urn:schemas-microsoft-com:vml" xmlns:w10="urn:schemas-microsoft-com:office:word" xmlns:a="http://schemas.openxmlformats.org/drawingml/2006/main" xmlns:pic="http://schemas.openxmlformats.org/drawingml/2006/picture" xmlns:wp="http://schemas.openxmlformats.org/drawingml/2006/wordprocessingDrawing">
   <w:body>
-    <w:bookmarkStart w:id="72" w:name="Xa6e576f325c97a1a94646645697ed4cc3fb76bf"/>
+    <w:bookmarkStart w:id="73" w:name="Xa6e576f325c97a1a94646645697ed4cc3fb76bf"/>
     <w:p>
       <w:pPr>
         <w:pStyle w:val="Heading1"/>
@@ -7165,7 +7165,7 @@
       </w:tr>
     </w:tbl>
     <w:bookmarkEnd w:id="70"/>
-    <w:bookmarkStart w:id="71" w:name="X5029eb0d1628c578dd07ce581f3054c2f13bc34"/>
+    <w:bookmarkStart w:id="72" w:name="X5029eb0d1628c578dd07ce581f3054c2f13bc34"/>
     <w:p>
       <w:pPr>
         <w:pStyle w:val="Heading2"/>
@@ -7416,8 +7416,45 @@
         <w:t xml:space="preserve">port-forward → Grafana dashboard with fresh traffic.</w:t>
       </w:r>
     </w:p>
-    <w:bookmarkEnd w:id="71"/>
+    <w:p>
+      <w:pPr>
+        <w:pStyle w:val="FirstParagraph"/>
+      </w:pPr>
+      <w:r>
+        <w:t xml:space="preserve">The recorded walkthrough is included in this repository at</w:t>
+      </w:r>
+      <w:r>
+        <w:t xml:space="preserve"> </w:t>
+      </w:r>
+      <w:hyperlink r:id="rId71">
+        <w:r>
+          <w:rPr>
+            <w:rStyle w:val="VerbatimChar"/>
+          </w:rPr>
+          <w:t xml:space="preserve">reports/pipeline_walkthrough.mp4</w:t>
+        </w:r>
+      </w:hyperlink>
+      <w:r>
+        <w:t xml:space="preserve"> </w:t>
+      </w:r>
+      <w:r>
+        <w:t xml:space="preserve">(1920×1080, ~3:20, captioned).</w:t>
+      </w:r>
+      <w:r>
+        <w:t xml:space="preserve"> </w:t>
+      </w:r>
+      <w:r>
+        <w:t xml:space="preserve">Every terminal segment is a live execution of the commands listed above, followed by live</w:t>
+      </w:r>
+      <w:r>
+        <w:t xml:space="preserve"> </w:t>
+      </w:r>
+      <w:r>
+        <w:t xml:space="preserve">captures of MLflow, the Grafana dashboard and Prometheus targets.</w:t>
+      </w:r>
+    </w:p>
     <w:bookmarkEnd w:id="72"/>
+    <w:bookmarkEnd w:id="73"/>
     <w:sectPr>
       <w:footnotePr>
         <w:numRestart w:val="eachSect"/>

</xml_diff>